<commit_message>
Navigation page and search dropdown added
</commit_message>
<xml_diff>
--- a/Specs.docx
+++ b/Specs.docx
@@ -40,37 +40,29 @@
     </w:p>
     <w:p>
       <w:pPr>
-        <w:spacing w:before="80" w:after="80"/>
         <w:jc w:val="center"/>
       </w:pPr>
-      <w:r>
-        <w:rPr>
-          <w:color w:val="78716C"/>
-          <w:sz w:val="20"/>
-          <w:szCs w:val="20"/>
-        </w:rPr>
-        <w:t xml:space="preserve">A Gamified Music Discovery </w:t>
-      </w:r>
-      <w:proofErr w:type="gramStart"/>
-      <w:r>
-        <w:rPr>
-          <w:color w:val="78716C"/>
-          <w:sz w:val="20"/>
-          <w:szCs w:val="20"/>
-        </w:rPr>
-        <w:t>World  |</w:t>
-      </w:r>
-      <w:proofErr w:type="gramEnd"/>
-      <w:r>
-        <w:rPr>
-          <w:color w:val="78716C"/>
-          <w:sz w:val="20"/>
-          <w:szCs w:val="20"/>
-        </w:rPr>
-        <w:t xml:space="preserve">  Frontend Internship Project</w:t>
-      </w:r>
-    </w:p>
-    <w:p/>
+      <w:hyperlink r:id="rId7" w:history="1">
+        <w:r>
+          <w:rPr>
+            <w:rStyle w:val="Hyperlink"/>
+          </w:rPr>
+          <w:t>tim</w:t>
+        </w:r>
+        <w:r>
+          <w:rPr>
+            <w:rStyle w:val="Hyperlink"/>
+          </w:rPr>
+          <w:t>b</w:t>
+        </w:r>
+        <w:r>
+          <w:rPr>
+            <w:rStyle w:val="Hyperlink"/>
+          </w:rPr>
+          <w:t>re</w:t>
+        </w:r>
+      </w:hyperlink>
+    </w:p>
     <w:p>
       <w:pPr>
         <w:pBdr>
@@ -249,7 +241,6 @@
           <w:sz w:val="21"/>
           <w:szCs w:val="21"/>
         </w:rPr>
-        <w:lastRenderedPageBreak/>
         <w:t>Why 3 eras and not more? Because each era requires a complete CSS scene, a unique visual language, and curated song data. Three eras done perfectly is infinitely more impressive than six eras done rushed. You can add eras after you send resumes.</w:t>
       </w:r>
     </w:p>
@@ -752,6 +743,7 @@
         <w:rPr>
           <w:color w:val="57534E"/>
         </w:rPr>
+        <w:lastRenderedPageBreak/>
         <w:t>Visual language: high saturation, raw textures, photocopied flyers, underlit rooms, VHS static. Energy swings between explosive and intimate. There is no clean line in the 90s — everything is either too bright or too dark.</w:t>
       </w:r>
     </w:p>
@@ -1223,18 +1215,18 @@
         <w:pStyle w:val="Heading2"/>
       </w:pPr>
       <w:r>
+        <w:t>Era 3 — Now (2020s)</w:t>
+      </w:r>
+    </w:p>
+    <w:p>
+      <w:pPr>
+        <w:spacing w:before="60" w:after="100"/>
+      </w:pPr>
+      <w:r>
+        <w:rPr>
+          <w:color w:val="57534E"/>
+        </w:rPr>
         <w:lastRenderedPageBreak/>
-        <w:t>Era 3 — Now (2020s)</w:t>
-      </w:r>
-    </w:p>
-    <w:p>
-      <w:pPr>
-        <w:spacing w:before="60" w:after="100"/>
-      </w:pPr>
-      <w:r>
-        <w:rPr>
-          <w:color w:val="57534E"/>
-        </w:rPr>
         <w:t>Visual language: harsh LED light, digital noise, oversaturated pastels clashing with pitch black, compressed JPEGs, meme references, the aesthetic of a screen at 3am. Chaotic but intentional.</w:t>
       </w:r>
     </w:p>
@@ -1714,6 +1706,7 @@
         <w:pStyle w:val="Heading1"/>
       </w:pPr>
       <w:r>
+        <w:lastRenderedPageBreak/>
         <w:t>3. Full User Journey — A to Z</w:t>
       </w:r>
     </w:p>
@@ -2030,22 +2023,22 @@
       </w:pPr>
       <w:proofErr w:type="gramStart"/>
       <w:r>
+        <w:t>3.3  Inside</w:t>
+      </w:r>
+      <w:proofErr w:type="gramEnd"/>
+      <w:r>
+        <w:t xml:space="preserve"> an Era — Venue Selection</w:t>
+      </w:r>
+    </w:p>
+    <w:p>
+      <w:pPr>
+        <w:spacing w:before="60" w:after="100"/>
+      </w:pPr>
+      <w:r>
+        <w:rPr>
+          <w:color w:val="57534E"/>
+        </w:rPr>
         <w:lastRenderedPageBreak/>
-        <w:t>3.3  Inside</w:t>
-      </w:r>
-      <w:proofErr w:type="gramEnd"/>
-      <w:r>
-        <w:t xml:space="preserve"> an Era — Venue Selection</w:t>
-      </w:r>
-    </w:p>
-    <w:p>
-      <w:pPr>
-        <w:spacing w:before="60" w:after="100"/>
-      </w:pPr>
-      <w:r>
-        <w:rPr>
-          <w:color w:val="57534E"/>
-        </w:rPr>
         <w:t>The user is now inside the era. They see a street scene of that era rendered entirely in CSS — the architecture, the lighting, the signage, all era-appropriate. Four buildings are visible on this street.</w:t>
       </w:r>
     </w:p>
@@ -2328,23 +2321,23 @@
           <w:sz w:val="24"/>
           <w:szCs w:val="24"/>
         </w:rPr>
+        <w:t>The Environment</w:t>
+      </w:r>
+    </w:p>
+    <w:p>
+      <w:pPr>
+        <w:pStyle w:val="ListParagraph"/>
+        <w:numPr>
+          <w:ilvl w:val="0"/>
+          <w:numId w:val="2"/>
+        </w:numPr>
+        <w:spacing w:before="50" w:after="70"/>
+      </w:pPr>
+      <w:r>
+        <w:rPr>
+          <w:color w:val="57534E"/>
+        </w:rPr>
         <w:lastRenderedPageBreak/>
-        <w:t>The Environment</w:t>
-      </w:r>
-    </w:p>
-    <w:p>
-      <w:pPr>
-        <w:pStyle w:val="ListParagraph"/>
-        <w:numPr>
-          <w:ilvl w:val="0"/>
-          <w:numId w:val="2"/>
-        </w:numPr>
-        <w:spacing w:before="50" w:after="70"/>
-      </w:pPr>
-      <w:r>
-        <w:rPr>
-          <w:color w:val="57534E"/>
-        </w:rPr>
         <w:t>The CSS interior scene fills the entire background and stays persistent throughout.</w:t>
       </w:r>
     </w:p>
@@ -9547,8 +9540,8 @@
       </w:r>
     </w:p>
     <w:sectPr>
-      <w:headerReference w:type="default" r:id="rId7"/>
-      <w:footerReference w:type="default" r:id="rId8"/>
+      <w:headerReference w:type="default" r:id="rId8"/>
+      <w:footerReference w:type="default" r:id="rId9"/>
       <w:pgSz w:w="12240" w:h="15840"/>
       <w:pgMar w:top="1440" w:right="1440" w:bottom="1440" w:left="1440" w:header="708" w:footer="708" w:gutter="0"/>
       <w:cols w:space="720"/>
@@ -9971,6 +9964,9 @@
     <w:lvlOverride w:ilvl="0">
       <w:startOverride w:val="1"/>
     </w:lvlOverride>
+  </w:num>
+  <w:num w:numId="5" w16cid:durableId="20395907">
+    <w:abstractNumId w:val="2"/>
   </w:num>
 </w:numbering>
 </file>
@@ -10372,6 +10368,7 @@
   </w:style>
   <w:style w:type="paragraph" w:styleId="Heading1">
     <w:name w:val="heading 1"/>
+    <w:link w:val="Heading1Char"/>
     <w:uiPriority w:val="9"/>
     <w:qFormat/>
     <w:pPr>
@@ -10621,6 +10618,45 @@
     <w:link w:val="Footer"/>
     <w:uiPriority w:val="99"/>
     <w:rsid w:val="00980559"/>
+  </w:style>
+  <w:style w:type="character" w:styleId="UnresolvedMention">
+    <w:name w:val="Unresolved Mention"/>
+    <w:basedOn w:val="DefaultParagraphFont"/>
+    <w:uiPriority w:val="99"/>
+    <w:semiHidden/>
+    <w:unhideWhenUsed/>
+    <w:rsid w:val="003D651F"/>
+    <w:rPr>
+      <w:color w:val="605E5C"/>
+      <w:shd w:val="clear" w:color="auto" w:fill="E1DFDD"/>
+    </w:rPr>
+  </w:style>
+  <w:style w:type="character" w:customStyle="1" w:styleId="Heading1Char">
+    <w:name w:val="Heading 1 Char"/>
+    <w:basedOn w:val="DefaultParagraphFont"/>
+    <w:link w:val="Heading1"/>
+    <w:uiPriority w:val="9"/>
+    <w:rsid w:val="003D651F"/>
+    <w:rPr>
+      <w:rFonts w:ascii="Georgia" w:eastAsia="Georgia" w:hAnsi="Georgia" w:cs="Georgia"/>
+      <w:b/>
+      <w:bCs/>
+      <w:color w:val="1C1917"/>
+      <w:sz w:val="38"/>
+      <w:szCs w:val="38"/>
+    </w:rPr>
+  </w:style>
+  <w:style w:type="character" w:styleId="FollowedHyperlink">
+    <w:name w:val="FollowedHyperlink"/>
+    <w:basedOn w:val="DefaultParagraphFont"/>
+    <w:uiPriority w:val="99"/>
+    <w:semiHidden/>
+    <w:unhideWhenUsed/>
+    <w:rsid w:val="003D651F"/>
+    <w:rPr>
+      <w:color w:val="954F72" w:themeColor="followedHyperlink"/>
+      <w:u w:val="single"/>
+    </w:rPr>
   </w:style>
 </w:styles>
 </file>

</xml_diff>